<commit_message>
docs: update ADMIN-GUIDE with new images and upload file size limits; add new user guides
</commit_message>
<xml_diff>
--- a/docs/Guide_on_the_Side_Librarian_User_Guide.docx
+++ b/docs/Guide_on_the_Side_Librarian_User_Guide.docx
@@ -7297,7 +7297,58 @@
         <w:spacing w:after="120"/>
       </w:pPr>
       <w:r>
-        <w:t>The right panel of each step displays embedded content. Three resource types are available:</w:t>
+        <w:t>The right panel of each step displays embedded content. You configure it using the resource toggle at the top of the Tutorial Resource section. Two modes are available:</w:t>
+      </w:r>
+    </w:p>
+    <w:p>
+      <w:pPr>
+        <w:jc w:val="center"/>
+      </w:pPr>
+      <w:r>
+        <w:drawing>
+          <wp:inline xmlns:a="http://schemas.openxmlformats.org/drawingml/2006/main" xmlns:pic="http://schemas.openxmlformats.org/drawingml/2006/picture">
+            <wp:extent cx="5029200" cy="2923953"/>
+            <wp:docPr id="1995346994" name="Picture 1995346994"/>
+            <wp:cNvGraphicFramePr>
+              <a:graphicFrameLocks noChangeAspect="1"/>
+            </wp:cNvGraphicFramePr>
+            <a:graphic>
+              <a:graphicData uri="http://schemas.openxmlformats.org/drawingml/2006/picture">
+                <pic:pic>
+                  <pic:nvPicPr>
+                    <pic:cNvPr id="0" name="right-panel-config.png"/>
+                    <pic:cNvPicPr/>
+                  </pic:nvPicPr>
+                  <pic:blipFill>
+                    <a:blip r:embed="rId29"/>
+                    <a:stretch>
+                      <a:fillRect/>
+                    </a:stretch>
+                  </pic:blipFill>
+                  <pic:spPr>
+                    <a:xfrm>
+                      <a:off x="0" y="0"/>
+                      <a:ext cx="5029200" cy="2923953"/>
+                    </a:xfrm>
+                    <a:prstGeom prst="rect"/>
+                  </pic:spPr>
+                </pic:pic>
+              </a:graphicData>
+            </a:graphic>
+          </wp:inline>
+        </w:drawing>
+      </w:r>
+    </w:p>
+    <w:p>
+      <w:pPr>
+        <w:jc w:val="center"/>
+      </w:pPr>
+      <w:r>
+        <w:rPr>
+          <w:i/>
+          <w:sz w:val="18"/>
+        </w:rPr>
+        <w:t>Figure 8 — Right Panel content source toggle between URL Mode and Upload File Mode</w:t>
       </w:r>
     </w:p>
     <w:tbl>
@@ -7566,58 +7617,243 @@
       <w:pPr>
         <w:spacing w:before="60" w:after="120"/>
       </w:pPr>
+      <w:r/>
+    </w:p>
+    <w:p>
       <w:r>
         <w:rPr>
           <w:b/>
-          <w:bCs/>
-          <w:color w:val="8C2004"/>
-          <w:sz w:val="20"/>
-          <w:szCs w:val="20"/>
+          <w:sz w:val="22"/>
         </w:rPr>
-        <w:t xml:space="preserve">⚠ Note: </w:t>
-      </w:r>
+        <w:t>URL Mode</w:t>
+      </w:r>
+    </w:p>
+    <w:p>
+      <w:r>
+        <w:t>Paste any web address into the URL field. The system automatically detects the content type:</w:t>
+      </w:r>
+    </w:p>
+    <w:p/>
+    <w:p>
+      <w:r>
+        <w:t>YouTube and Vimeo links: Automatically converted to embed format and displayed as an inline video player.</w:t>
+      </w:r>
+    </w:p>
+    <w:p>
+      <w:r>
+        <w:t>Standard web pages: Loaded in an iframe within the right panel. This works for most public websites.</w:t>
+      </w:r>
+    </w:p>
+    <w:p>
+      <w:r>
+        <w:t>Google Docs, Sheets, and Slides: Shared links are displayed using Google's document viewer.</w:t>
+      </w:r>
+    </w:p>
+    <w:p/>
+    <w:p>
+      <w:r>
+        <w:rPr>
+          <w:b/>
+          <w:sz w:val="22"/>
+        </w:rPr>
+        <w:t>Upload File Mode</w:t>
+      </w:r>
+    </w:p>
+    <w:p>
+      <w:pPr>
+        <w:jc w:val="center"/>
+      </w:pPr>
+      <w:r>
+        <w:drawing>
+          <wp:inline xmlns:a="http://schemas.openxmlformats.org/drawingml/2006/main" xmlns:pic="http://schemas.openxmlformats.org/drawingml/2006/picture">
+            <wp:extent cx="5029200" cy="2456121"/>
+            <wp:docPr id="1995346993" name="Picture 1995346993"/>
+            <wp:cNvGraphicFramePr>
+              <a:graphicFrameLocks noChangeAspect="1"/>
+            </wp:cNvGraphicFramePr>
+            <a:graphic>
+              <a:graphicData uri="http://schemas.openxmlformats.org/drawingml/2006/picture">
+                <pic:pic>
+                  <pic:nvPicPr>
+                    <pic:cNvPr id="0" name="upload-file-mode.png"/>
+                    <pic:cNvPicPr/>
+                  </pic:nvPicPr>
+                  <pic:blipFill>
+                    <a:blip r:embed="rId28"/>
+                    <a:stretch>
+                      <a:fillRect/>
+                    </a:stretch>
+                  </pic:blipFill>
+                  <pic:spPr>
+                    <a:xfrm>
+                      <a:off x="0" y="0"/>
+                      <a:ext cx="5029200" cy="2456121"/>
+                    </a:xfrm>
+                    <a:prstGeom prst="rect"/>
+                  </pic:spPr>
+                </pic:pic>
+              </a:graphicData>
+            </a:graphic>
+          </wp:inline>
+        </w:drawing>
+      </w:r>
+    </w:p>
+    <w:p>
+      <w:pPr>
+        <w:jc w:val="center"/>
+      </w:pPr>
       <w:r>
         <w:rPr>
           <w:i/>
-          <w:iCs/>
-          <w:color w:val="555555"/>
-          <w:sz w:val="20"/>
-          <w:szCs w:val="20"/>
+          <w:sz w:val="18"/>
         </w:rPr>
-        <w:t xml:space="preserve">Some websites may not embed properly in </w:t>
-      </w:r>
-      <w:proofErr w:type="spellStart"/>
+        <w:t>Figure 9 — Upload File Mode for attaching PDFs, images, audio, and video to steps</w:t>
+      </w:r>
+    </w:p>
+    <w:p>
+      <w:r>
+        <w:t>Click the upload zone (or drag and drop a file) to attach a file directly to the step. Supported file types and how they display:</w:t>
+      </w:r>
+    </w:p>
+    <w:p/>
+    <w:p>
+      <w:r>
+        <w:t>PDF files (.pdf): Displayed in an embedded PDF viewer within the right panel. Students can scroll, zoom, and navigate pages without leaving the tutorial.</w:t>
+      </w:r>
+    </w:p>
+    <w:p>
+      <w:r>
+        <w:t>Images (.jpg, .png, .gif): Displayed directly in the right panel.</w:t>
+      </w:r>
+    </w:p>
+    <w:p>
+      <w:r>
+        <w:t>Audio files (.mp3, .wav, .ogg, .m4a): Rendered with a browser audio player.</w:t>
+      </w:r>
+    </w:p>
+    <w:p>
+      <w:r>
+        <w:t>Video files (.mp4, .webm, .mov): Rendered with a browser video player.</w:t>
+      </w:r>
+    </w:p>
+    <w:p>
+      <w:r>
+        <w:t>Documents (.doc, .docx, .ppt, .pptx, .xls, .xlsx): Opened using Google Docs Viewer as a fallback. Requires an internet connection.</w:t>
+      </w:r>
+    </w:p>
+    <w:p>
+      <w:r>
+        <w:t>Other files: A download link is provided for the student to save the file.</w:t>
+      </w:r>
+    </w:p>
+    <w:p/>
+    <w:p>
+      <w:r>
+        <w:rPr>
+          <w:b/>
+          <w:sz w:val="22"/>
+        </w:rPr>
+        <w:t>Content That Will Not Embed</w:t>
+      </w:r>
+    </w:p>
+    <w:p>
+      <w:r>
+        <w:t>Some websites block iframe embedding using security headers (X-Frame-Options or Content-Security-Policy). Common examples include:</w:t>
+      </w:r>
+    </w:p>
+    <w:p/>
+    <w:p>
+      <w:r>
+        <w:t>Academic databases (EBSCO, ProQuest, JSTOR, PubMed)</w:t>
+      </w:r>
+    </w:p>
+    <w:p>
+      <w:r>
+        <w:t>Library catalogue systems (e.g., library.upei.ca)</w:t>
+      </w:r>
+    </w:p>
+    <w:p>
+      <w:r>
+        <w:t>Banking, government, and login-protected portals</w:t>
+      </w:r>
+    </w:p>
+    <w:p>
+      <w:r>
+        <w:t>Some news sites and social media platforms</w:t>
+      </w:r>
+    </w:p>
+    <w:p/>
+    <w:p>
+      <w:r>
+        <w:t>When a URL cannot be embedded, the system automatically detects this and provides a fallback: a prominent "Open in new tab" button appears in the right panel so students can view the resource in a separate browser tab while keeping the quiz instructions visible on the left.</w:t>
+      </w:r>
+    </w:p>
+    <w:p/>
+    <w:p>
+      <w:r>
+        <w:t>Tip: Test each step's resource by previewing the tutorial before publishing. If the right panel shows a blank area or loading error, the resource likely blocks embedding — consider using the "Open in new tab" approach or uploading the content as a PDF instead.</w:t>
+      </w:r>
+    </w:p>
+    <w:p>
+      <w:pPr>
+        <w:pStyle w:val="Heading2"/>
+      </w:pPr>
+      <w:bookmarkStart w:id="24" w:name="_Toc227060570"/>
+      <w:r>
+        <w:t>4.5 Branching Sub-Tutorials</w:t>
+      </w:r>
+      <w:bookmarkEnd w:id="24"/>
+    </w:p>
+    <w:p>
+      <w:pPr>
+        <w:jc w:val="center"/>
+      </w:pPr>
+      <w:r>
+        <w:drawing>
+          <wp:inline xmlns:a="http://schemas.openxmlformats.org/drawingml/2006/main" xmlns:pic="http://schemas.openxmlformats.org/drawingml/2006/picture">
+            <wp:extent cx="5029200" cy="2631558"/>
+            <wp:docPr id="1995346992" name="Picture 1995346992"/>
+            <wp:cNvGraphicFramePr>
+              <a:graphicFrameLocks noChangeAspect="1"/>
+            </wp:cNvGraphicFramePr>
+            <a:graphic>
+              <a:graphicData uri="http://schemas.openxmlformats.org/drawingml/2006/picture">
+                <pic:pic>
+                  <pic:nvPicPr>
+                    <pic:cNvPr id="0" name="branching-config.png"/>
+                    <pic:cNvPicPr/>
+                  </pic:nvPicPr>
+                  <pic:blipFill>
+                    <a:blip r:embed="rId27"/>
+                    <a:stretch>
+                      <a:fillRect/>
+                    </a:stretch>
+                  </pic:blipFill>
+                  <pic:spPr>
+                    <a:xfrm>
+                      <a:off x="0" y="0"/>
+                      <a:ext cx="5029200" cy="2631558"/>
+                    </a:xfrm>
+                    <a:prstGeom prst="rect"/>
+                  </pic:spPr>
+                </pic:pic>
+              </a:graphicData>
+            </a:graphic>
+          </wp:inline>
+        </w:drawing>
+      </w:r>
+    </w:p>
+    <w:p>
+      <w:pPr>
+        <w:jc w:val="center"/>
+      </w:pPr>
       <w:r>
         <w:rPr>
           <w:i/>
-          <w:iCs/>
-          <w:color w:val="555555"/>
-          <w:sz w:val="20"/>
-          <w:szCs w:val="20"/>
+          <w:sz w:val="18"/>
         </w:rPr>
-        <w:t>iframes</w:t>
-      </w:r>
-      <w:proofErr w:type="spellEnd"/>
-      <w:r>
-        <w:rPr>
-          <w:i/>
-          <w:iCs/>
-          <w:color w:val="555555"/>
-          <w:sz w:val="20"/>
-          <w:szCs w:val="20"/>
-        </w:rPr>
-        <w:t xml:space="preserve"> due to security headers (X-Frame-Options or Content-Security-Policy). If content does not display, a fallback “Open in new window” link is automatically provided. Students can click this to view the resource in a separate browser tab while keeping the tutorial instructions visible on the left.</w:t>
-      </w:r>
-    </w:p>
-    <w:p>
-      <w:pPr>
-        <w:pStyle w:val="Heading2"/>
-      </w:pPr>
-      <w:bookmarkStart w:id="24" w:name="_Toc227060570"/>
-      <w:r>
-        <w:t>4.5 Branching Sub-Tutorials</w:t>
-      </w:r>
-      <w:bookmarkEnd w:id="24"/>
+        <w:t>Figure 10 — Branching logic configuration with conditional step navigation</w:t>
+      </w:r>
     </w:p>
     <w:p>
       <w:pPr>
@@ -8344,7 +8580,7 @@
           <w:sz w:val="18"/>
           <w:szCs w:val="18"/>
         </w:rPr>
-        <w:t>Figure 8 — Guide Settings page with site-wide defaults for layout, benchmarks, and privacy</w:t>
+        <w:t>Figure 11 — Guide Settings page with site-wide defaults for layout, benchmarks, and privacy</w:t>
       </w:r>
     </w:p>
     <w:p>
@@ -8464,7 +8700,7 @@
           <w:sz w:val="18"/>
           <w:szCs w:val="18"/>
         </w:rPr>
-        <w:t>Figure 9 — Manage Librarians page with user table and role management</w:t>
+        <w:t>Figure 12 — Manage Librarians page with user table and role management</w:t>
       </w:r>
     </w:p>
     <w:p>
@@ -8623,7 +8859,7 @@
           <w:sz w:val="18"/>
           <w:szCs w:val="18"/>
         </w:rPr>
-        <w:t>Figure 10 — Tutorial Analytics dashboard with KPI cards and performance badges</w:t>
+        <w:t>Figure 13 — Tutorial Analytics dashboard with KPI cards and performance badges</w:t>
       </w:r>
     </w:p>
     <w:p>
@@ -8823,7 +9059,7 @@
           <w:sz w:val="18"/>
           <w:szCs w:val="18"/>
         </w:rPr>
-        <w:t>Figure 11 — User profile access location</w:t>
+        <w:t>Figure 14 — User profile access location</w:t>
       </w:r>
     </w:p>
     <w:p>
@@ -8905,7 +9141,7 @@
           <w:sz w:val="18"/>
           <w:szCs w:val="18"/>
         </w:rPr>
-        <w:t>Figure 12 — Custom per-user administration color schemes available under the ‘Personal Options’ section</w:t>
+        <w:t>Figure 15 — Custom per-user administration color schemes available under the ‘Personal Options’ section</w:t>
       </w:r>
     </w:p>
     <w:p>
@@ -8913,7 +9149,37 @@
         <w:t>At the bottom of the user profile page, users can change their preferred focus indicator color and outline width. Additionally, the sitewide font family option provides custom font choices from the system default to the UPEI Library standard (alongside some generic options such as Arial, Verdana, and Tahoma).</w:t>
       </w:r>
     </w:p>
+    <w:p>
+      <w:r>
+        <w:t>To export a tutorial:</w:t>
+      </w:r>
+    </w:p>
+    <w:p>
+      <w:r>
+        <w:t>1. Navigate to My Tutorials in the left sidebar menu.</w:t>
+      </w:r>
+    </w:p>
+    <w:p>
+      <w:r>
+        <w:t>2. Find the tutorial card you want to export.</w:t>
+      </w:r>
+    </w:p>
+    <w:p>
+      <w:r>
+        <w:t>3. Click the Export button on the tutorial card (bottom row of action buttons, rightmost).</w:t>
+      </w:r>
+    </w:p>
+    <w:p>
+      <w:r>
+        <w:t>4. Your browser downloads a .json file named after the tutorial (e.g., library-catalogue-search-guide-on-the-side.json).</w:t>
+      </w:r>
+    </w:p>
     <w:p/>
+    <w:p>
+      <w:r>
+        <w:t>The export package includes the complete tutorial: title, introduction fields, all step configurations, quiz content, header note, and any uploaded file attachments (encoded within the JSON file). The file can be shared via email, USB drive, or cloud storage.</w:t>
+      </w:r>
+    </w:p>
     <w:p/>
     <w:p>
       <w:r>
@@ -8978,7 +9244,7 @@
           <w:sz w:val="18"/>
           <w:szCs w:val="18"/>
         </w:rPr>
-        <w:t>Figure 13 — Custom focus indication and fonts available under the ‘Accessibility Settings’ section</w:t>
+        <w:t>Figure 16 — Custom focus indication and fonts available under the ‘Accessibility Settings’ section</w:t>
       </w:r>
     </w:p>
     <w:p>
@@ -9042,7 +9308,7 @@
           <w:sz w:val="18"/>
           <w:szCs w:val="18"/>
         </w:rPr>
-        <w:t>Figure 14 — Custom keyboard shortcuts for tutorials and a preview section for focus changes</w:t>
+        <w:t>Figure 17 — Custom keyboard shortcuts for tutorials and a preview section for focus changes</w:t>
       </w:r>
     </w:p>
     <w:p>
@@ -9198,6 +9464,57 @@
     </w:p>
     <w:p>
       <w:pPr>
+        <w:jc w:val="center"/>
+      </w:pPr>
+      <w:r>
+        <w:drawing>
+          <wp:inline xmlns:a="http://schemas.openxmlformats.org/drawingml/2006/main" xmlns:pic="http://schemas.openxmlformats.org/drawingml/2006/picture">
+            <wp:extent cx="5029200" cy="2339163"/>
+            <wp:docPr id="1995346991" name="Picture 1995346991"/>
+            <wp:cNvGraphicFramePr>
+              <a:graphicFrameLocks noChangeAspect="1"/>
+            </wp:cNvGraphicFramePr>
+            <a:graphic>
+              <a:graphicData uri="http://schemas.openxmlformats.org/drawingml/2006/picture">
+                <pic:pic>
+                  <pic:nvPicPr>
+                    <pic:cNvPr id="0" name="export-import.png"/>
+                    <pic:cNvPicPr/>
+                  </pic:nvPicPr>
+                  <pic:blipFill>
+                    <a:blip r:embed="rId26"/>
+                    <a:stretch>
+                      <a:fillRect/>
+                    </a:stretch>
+                  </pic:blipFill>
+                  <pic:spPr>
+                    <a:xfrm>
+                      <a:off x="0" y="0"/>
+                      <a:ext cx="5029200" cy="2339163"/>
+                    </a:xfrm>
+                    <a:prstGeom prst="rect"/>
+                  </pic:spPr>
+                </pic:pic>
+              </a:graphicData>
+            </a:graphic>
+          </wp:inline>
+        </w:drawing>
+      </w:r>
+    </w:p>
+    <w:p>
+      <w:pPr>
+        <w:jc w:val="center"/>
+      </w:pPr>
+      <w:r>
+        <w:rPr>
+          <w:i/>
+          <w:sz w:val="18"/>
+        </w:rPr>
+        <w:t>Figure 18 — Export and Import tutorial interface with JSON file upload</w:t>
+      </w:r>
+    </w:p>
+    <w:p>
+      <w:pPr>
         <w:pStyle w:val="Heading2"/>
       </w:pPr>
       <w:bookmarkStart w:id="43" w:name="_Toc227060589"/>
@@ -9219,15 +9536,33 @@
         <w:spacing w:after="120"/>
       </w:pPr>
       <w:r>
-        <w:t>To export: from the Tutorials list or Edit Tutorial screen, use the Export action. The browser downloads a .</w:t>
-      </w:r>
-      <w:proofErr w:type="spellStart"/>
-      <w:r>
-        <w:t>json</w:t>
-      </w:r>
-      <w:proofErr w:type="spellEnd"/>
-      <w:r>
-        <w:t xml:space="preserve"> file.</w:t>
+        <w:t>To export a tutorial:</w:t>
+      </w:r>
+    </w:p>
+    <w:p>
+      <w:r>
+        <w:t>1. Navigate to My Tutorials in the left sidebar menu.</w:t>
+      </w:r>
+    </w:p>
+    <w:p>
+      <w:r>
+        <w:t>2. Find the tutorial card you want to export.</w:t>
+      </w:r>
+    </w:p>
+    <w:p>
+      <w:r>
+        <w:t>3. Click the Export button on the tutorial card (bottom-right of the action buttons).</w:t>
+      </w:r>
+    </w:p>
+    <w:p>
+      <w:r>
+        <w:t>4. Your browser downloads a .json file named after the tutorial.</w:t>
+      </w:r>
+    </w:p>
+    <w:p/>
+    <w:p>
+      <w:r>
+        <w:t>The export package includes the complete tutorial: title, introduction fields, all steps, quiz content, header note, and uploaded file attachments (encoded within the JSON).</w:t>
       </w:r>
     </w:p>
     <w:p>
@@ -9246,6 +9581,37 @@
       </w:pPr>
       <w:r>
         <w:t>To import a previously exported tutorial:</w:t>
+      </w:r>
+    </w:p>
+    <w:p>
+      <w:r>
+        <w:t>1. Navigate to My Tutorials in the left sidebar menu.</w:t>
+      </w:r>
+    </w:p>
+    <w:p>
+      <w:r>
+        <w:t>2. At the top of the page, locate the Import Tutorial panel (grey box with a dashed border).</w:t>
+      </w:r>
+    </w:p>
+    <w:p>
+      <w:r>
+        <w:t>3. Click Choose File and select the .json export file from your computer.</w:t>
+      </w:r>
+    </w:p>
+    <w:p>
+      <w:r>
+        <w:t>4. Click the green Import button.</w:t>
+      </w:r>
+    </w:p>
+    <w:p>
+      <w:r>
+        <w:t>5. The system creates a new tutorial as a Draft with all the original content, steps, and uploaded media.</w:t>
+      </w:r>
+    </w:p>
+    <w:p/>
+    <w:p>
+      <w:r>
+        <w:t>Note: Imported tutorials are created as Drafts. Review the content and publish when ready. H5P quiz content is recreated during import, so H5P IDs will differ from the original. The target server must have the same H5P content types installed (Multiple Choice, Single Choice, Fill in the Blanks) for quizzes to function after import.</w:t>
       </w:r>
     </w:p>
     <w:p>
@@ -9257,9 +9623,6 @@
         </w:numPr>
         <w:spacing w:after="80"/>
       </w:pPr>
-      <w:r>
-        <w:t>Navigate to the Import section (available from the Tutorials management area).</w:t>
-      </w:r>
     </w:p>
     <w:p>
       <w:pPr>
@@ -9270,17 +9633,6 @@
         </w:numPr>
         <w:spacing w:after="80"/>
       </w:pPr>
-      <w:r>
-        <w:t>Select the exported .</w:t>
-      </w:r>
-      <w:proofErr w:type="spellStart"/>
-      <w:r>
-        <w:t>json</w:t>
-      </w:r>
-      <w:proofErr w:type="spellEnd"/>
-      <w:r>
-        <w:t xml:space="preserve"> file from your computer.</w:t>
-      </w:r>
     </w:p>
     <w:p>
       <w:pPr>
@@ -9291,40 +9643,13 @@
         </w:numPr>
         <w:spacing w:after="80"/>
       </w:pPr>
-      <w:r>
-        <w:t>Click Import. The system creates a new tutorial with all the configuration and content from the file.</w:t>
-      </w:r>
     </w:p>
     <w:p>
       <w:pPr>
         <w:spacing w:before="60" w:after="120"/>
       </w:pPr>
-      <w:r>
-        <w:rPr>
-          <w:b/>
-          <w:bCs/>
-          <w:color w:val="8C2004"/>
-          <w:sz w:val="20"/>
-          <w:szCs w:val="20"/>
-        </w:rPr>
-        <w:t xml:space="preserve">⚠ Note: </w:t>
-      </w:r>
-      <w:r>
-        <w:rPr>
-          <w:i/>
-          <w:iCs/>
-          <w:color w:val="555555"/>
-          <w:sz w:val="20"/>
-          <w:szCs w:val="20"/>
-        </w:rPr>
-        <w:t>Imported tutorials are created as Drafts. You should review the content and publish when ready. H5P content items are recreated during import, so H5P IDs will differ from the original.</w:t>
-      </w:r>
-    </w:p>
-    <w:p>
-      <w:r>
-        <w:br w:type="page"/>
-      </w:r>
-    </w:p>
+    </w:p>
+    <w:p/>
     <w:p>
       <w:pPr>
         <w:pStyle w:val="Heading1"/>
@@ -9424,7 +9749,7 @@
           <w:sz w:val="18"/>
           <w:szCs w:val="18"/>
         </w:rPr>
-        <w:t>Figure 1</w:t>
+        <w:t>Figure 19 — Student-facing introduction screen with learning objectives and Start Tutorial button</w:t>
       </w:r>
       <w:r>
         <w:rPr>
@@ -9434,7 +9759,6 @@
           <w:sz w:val="18"/>
           <w:szCs w:val="18"/>
         </w:rPr>
-        <w:t>5</w:t>
       </w:r>
       <w:r>
         <w:rPr>
@@ -9444,7 +9768,6 @@
           <w:sz w:val="18"/>
           <w:szCs w:val="18"/>
         </w:rPr>
-        <w:t xml:space="preserve"> — Student-facing introduction screen with learning objectives and Start Tutorial button</w:t>
       </w:r>
     </w:p>
     <w:p>

</xml_diff>